<commit_message>
docs: update Process.docx to match current pipeline state
Critical corrections:
- Fix §5.1 TTC planned contrasts: all three (8.33/12.5/25 Hz vs 0 Hz) are
  non-significant (p = .426, Holm), NOT significant as previously stated.
  Add explanatory note: overall F significant but driven by between-flicker
  differences (25 Hz > 8.33/12.5 Hz), not vs stable baseline.

Count updates:
- CSV output count: 59 → 62 (§1.2, §7.1, footer)
- PNG output count: 17 → 21 (§1.2, §7.2, footer)
- Script count: 14 → 15 (14 R + 1 Python); date: 2026-05-27 → 2026-05-28
- 10_plots.R figure count: 14 → 16 (added fig_qq_ratings, fig_qq_eye)

New content:
- §3.15: document 13_post_survey_descriptives.py (post-experiment questionnaire
  descriptive analysis; 9 ordinal items; 3 CSV + 2 PNG outputs)

Co-Authored-By: Claude Sonnet 4.6 <noreply@anthropic.com>
</commit_message>
<xml_diff>
--- a/writing_reference/Process.docx
+++ b/writing_reference/Process.docx
@@ -596,7 +596,7 @@
           <w:rFonts w:ascii="Microsoft YaHei" w:hAnsi="Microsoft YaHei"/>
           <w:sz w:val="21"/>
         </w:rPr>
-        <w:t>output/tables/                          ← 所有 CSV 结果（共 59 个）</w:t>
+        <w:t>output/tables/                          ← 所有 CSV 结果（共 62 个）</w:t>
       </w:r>
     </w:p>
     <w:p>
@@ -609,7 +609,7 @@
           <w:rFonts w:ascii="Microsoft YaHei" w:hAnsi="Microsoft YaHei"/>
           <w:sz w:val="21"/>
         </w:rPr>
-        <w:t>output/figures/                         ← 所有图表（共 17 个 PNG）</w:t>
+        <w:t>output/figures/                         ← 所有图表（共 21 个 PNG）</w:t>
       </w:r>
     </w:p>
     <w:p/>
@@ -4988,7 +4988,7 @@
           <w:b w:val="0"/>
           <w:sz w:val="21"/>
         </w:rPr>
-        <w:t>生成论文中使用的 14 个主要图表（300 dpi PNG）。每张图都有明确的研究问题对应关系。</w:t>
+        <w:t>生成论文中使用的 16 个主要图表（300 dpi PNG）。每张图都有明确的研究问题对应关系。</w:t>
       </w:r>
     </w:p>
     <w:p>
@@ -7027,6 +7027,214 @@
     <w:p/>
     <w:p>
       <w:pPr>
+        <w:pStyle w:val="Heading2"/>
+      </w:pPr>
+      <w:r>
+        <w:t xml:space="preserve">3.15  13_post_survey_descriptives.py — 实验后问卷描述性分析（Python）</w:t>
+      </w:r>
+    </w:p>
+    <w:p>
+      <w:pPr>
+        <w:pStyle w:val="Normal"/>
+      </w:pPr>
+      <w:r>
+        <w:t xml:space="preserve">本脚本对实验结束后填写的问卷进行描述性统计分析，涵盖驾驶困难度、心理负荷、努力程度、CMS 运动清晰度、闪烁干扰、视觉不适、决策自信度、闪烁可察觉度和闪烁对决策影响 9 个维度。分析结果可作为操纵检验（确认闪烁被感知）和主观评价量表的聚合效度证据。</w:t>
+      </w:r>
+    </w:p>
+    <w:p>
+      <w:pPr>
+        <w:pStyle w:val="Normal"/>
+      </w:pPr>
+      <w:r>
+        <w:t xml:space="preserve">输入数据：</w:t>
+      </w:r>
+    </w:p>
+    <w:p>
+      <w:pPr>
+        <w:pStyle w:val="ListBullet"/>
+      </w:pPr>
+      <w:r>
+        <w:t xml:space="preserve">1. Experiment_Result/Google Forms/Post-Experiment Questionnaire  (Responses).xlsx</w:t>
+      </w:r>
+    </w:p>
+    <w:p>
+      <w:pPr>
+        <w:pStyle w:val="ListBullet"/>
+      </w:pPr>
+      <w:r>
+        <w:t xml:space="preserve">注：文件名含双空格，脚本使用精确字符串匹配读取</w:t>
+      </w:r>
+    </w:p>
+    <w:p>
+      <w:pPr>
+        <w:pStyle w:val="Normal"/>
+      </w:pPr>
+      <w:r>
+        <w:t xml:space="preserve">9 题有序量表（括号内为选项数量）：</w:t>
+      </w:r>
+    </w:p>
+    <w:p>
+      <w:pPr>
+        <w:pStyle w:val="ListBullet"/>
+      </w:pPr>
+      <w:r>
+        <w:t xml:space="preserve">Q1 驾驶道路变换困难度（6 级：Easy → Very difficult）</w:t>
+      </w:r>
+    </w:p>
+    <w:p>
+      <w:pPr>
+        <w:pStyle w:val="ListBullet"/>
+      </w:pPr>
+      <w:r>
+        <w:t xml:space="preserve">Q2 心理负荷（6 级：Low → Very high）</w:t>
+      </w:r>
+    </w:p>
+    <w:p>
+      <w:pPr>
+        <w:pStyle w:val="ListBullet"/>
+      </w:pPr>
+      <w:r>
+        <w:t xml:space="preserve">Q3 付出努力（6 级：Little → Very much）</w:t>
+      </w:r>
+    </w:p>
+    <w:p>
+      <w:pPr>
+        <w:pStyle w:val="ListBullet"/>
+      </w:pPr>
+      <w:r>
+        <w:t xml:space="preserve">Q4 CMS 运动清晰度（6 级：Very unclear → Clear）</w:t>
+      </w:r>
+    </w:p>
+    <w:p>
+      <w:pPr>
+        <w:pStyle w:val="ListBullet"/>
+      </w:pPr>
+      <w:r>
+        <w:t xml:space="preserve">Q5 闪烁干扰感（5 级：Slightly → Extremely）</w:t>
+      </w:r>
+    </w:p>
+    <w:p>
+      <w:pPr>
+        <w:pStyle w:val="ListBullet"/>
+      </w:pPr>
+      <w:r>
+        <w:t xml:space="preserve">Q6 视觉不适 / 眼疲劳（5 级：Hardly any → Severe）</w:t>
+      </w:r>
+    </w:p>
+    <w:p>
+      <w:pPr>
+        <w:pStyle w:val="ListBullet"/>
+      </w:pPr>
+      <w:r>
+        <w:t xml:space="preserve">Q7 决策自信度（5 级：Not confident at all → Confident）</w:t>
+      </w:r>
+    </w:p>
+    <w:p>
+      <w:pPr>
+        <w:pStyle w:val="ListBullet"/>
+      </w:pPr>
+      <w:r>
+        <w:t xml:space="preserve">Q8 闪烁差异可察觉度（4 级：Slightly noticeable → Extremely noticeable）</w:t>
+      </w:r>
+    </w:p>
+    <w:p>
+      <w:pPr>
+        <w:pStyle w:val="ListBullet"/>
+      </w:pPr>
+      <w:r>
+        <w:t xml:space="preserve">Q9 闪烁对决策的影响（5 级：Hardly at all → Significantly）</w:t>
+      </w:r>
+    </w:p>
+    <w:p>
+      <w:pPr>
+        <w:pStyle w:val="Normal"/>
+      </w:pPr>
+      <w:r>
+        <w:t xml:space="preserve">统计方法：</w:t>
+      </w:r>
+    </w:p>
+    <w:p>
+      <w:pPr>
+        <w:pStyle w:val="ListBullet"/>
+      </w:pPr>
+      <w:r>
+        <w:t xml:space="preserve">描述性统计：M、SD、中位数、IQR（Pandas / SciPy）</w:t>
+      </w:r>
+    </w:p>
+    <w:p>
+      <w:pPr>
+        <w:pStyle w:val="ListBullet"/>
+      </w:pPr>
+      <w:r>
+        <w:t xml:space="preserve">众数：每题出现频率最高的回答选项</w:t>
+      </w:r>
+    </w:p>
+    <w:p>
+      <w:pPr>
+        <w:pStyle w:val="ListBullet"/>
+      </w:pPr>
+      <w:r>
+        <w:t xml:space="preserve">频率分布：每个回答选项的 n 和百分比</w:t>
+      </w:r>
+    </w:p>
+    <w:p>
+      <w:pPr>
+        <w:pStyle w:val="ListBullet"/>
+      </w:pPr>
+      <w:r>
+        <w:t xml:space="preserve">注：问卷为单次施测（非重复测量），不进行推断性统计（无组内变异可检验）</w:t>
+      </w:r>
+    </w:p>
+    <w:p>
+      <w:pPr>
+        <w:pStyle w:val="Normal"/>
+      </w:pPr>
+      <w:r>
+        <w:t xml:space="preserve">输出文件（共 3 个 CSV + 2 个 PNG）：</w:t>
+      </w:r>
+    </w:p>
+    <w:p>
+      <w:pPr>
+        <w:pStyle w:val="ListBullet"/>
+      </w:pPr>
+      <w:r>
+        <w:t xml:space="preserve">output/tables/13_post_survey_raw.csv  ← 参与者级别原始文本回答 + 数字编码</w:t>
+      </w:r>
+    </w:p>
+    <w:p>
+      <w:pPr>
+        <w:pStyle w:val="ListBullet"/>
+      </w:pPr>
+      <w:r>
+        <w:t xml:space="preserve">output/tables/13_post_survey_descriptives.csv  ← 9 题的 M、SD、中位数、IQR、众数</w:t>
+      </w:r>
+    </w:p>
+    <w:p>
+      <w:pPr>
+        <w:pStyle w:val="ListBullet"/>
+      </w:pPr>
+      <w:r>
+        <w:t xml:space="preserve">output/tables/13_post_survey_frequencies.csv  ← 每题各选项的 n 和百分比</w:t>
+      </w:r>
+    </w:p>
+    <w:p>
+      <w:pPr>
+        <w:pStyle w:val="ListBullet"/>
+      </w:pPr>
+      <w:r>
+        <w:t xml:space="preserve">output/figures/fig_post_survey_stacked.png  ← 9 题堆叠水平条形图（含中位数虚线）</w:t>
+      </w:r>
+    </w:p>
+    <w:p>
+      <w:pPr>
+        <w:pStyle w:val="ListBullet"/>
+      </w:pPr>
+      <w:r>
+        <w:t xml:space="preserve">output/figures/fig_post_survey_summary.png  ← 归一化点图：中位数（红圆）± IQR（蓝线）+ 均值（蓝菱形）</w:t>
+      </w:r>
+    </w:p>
+    <w:p>
+      <w:pPr>
         <w:pStyle w:val="Heading1"/>
       </w:pPr>
       <w:r>
@@ -7336,7 +7544,7 @@
           <w:rFonts w:ascii="Microsoft YaHei" w:hAnsi="Microsoft YaHei"/>
           <w:sz w:val="21"/>
         </w:rPr>
-        <w:t>8.33 Hz vs 0 Hz：显著（p &lt; .05，Holm 校正）</w:t>
+        <w:t>8.33 Hz vs 0 Hz：不显著（p = .426，Holm 校正；t(24) = −1.311，95% CI [−0.644, 0.209] s）</w:t>
       </w:r>
     </w:p>
     <w:p>
@@ -7349,7 +7557,7 @@
           <w:rFonts w:ascii="Microsoft YaHei" w:hAnsi="Microsoft YaHei"/>
           <w:sz w:val="21"/>
         </w:rPr>
-        <w:t>12.5 Hz vs 0 Hz：显著（p &lt; .01）</w:t>
+        <w:t>12.5 Hz vs 0 Hz：不显著（p = .426，Holm 校正；t(24) = −1.518，95% CI [−0.768, 0.198] s）</w:t>
       </w:r>
     </w:p>
     <w:p>
@@ -7362,7 +7570,18 @@
           <w:rFonts w:ascii="Microsoft YaHei" w:hAnsi="Microsoft YaHei"/>
           <w:sz w:val="21"/>
         </w:rPr>
-        <w:t>25 Hz vs 0 Hz：显著（p &lt; .001）</w:t>
+        <w:t>25 Hz vs 0 Hz：不显著（p = .426，Holm 校正；t(24) = +1.225，95% CI [−0.236, 0.664] s）</w:t>
+      </w:r>
+    </w:p>
+    <w:p>
+      <w:pPr>
+        <w:pStyle w:val="Normal"/>
+      </w:pPr>
+      <w:r>
+        <w:rPr>
+          <w:b/>
+        </w:rPr>
+        <w:t xml:space="preserve">注：Step 1 整体频率主效应显著，F(1.83, 43.91) = 5.094，p = .012，η²p = .175（中等）。但三个计划对比（各闪烁频率 vs 0 Hz 稳定条件，Holm 校正）均未达显著水平（所有 p = .426），表明频率效应由闪烁条件之间的差异驱动——尤其是 25 Hz TTC 显著长于 8.33 Hz 和 12.5 Hz——而非单个闪烁频率与稳定基线的差异。</w:t>
       </w:r>
     </w:p>
     <w:p/>
@@ -8756,7 +8975,7 @@
           <w:b/>
           <w:sz w:val="21"/>
         </w:rPr>
-        <w:t>7.1  所有 CSV 文件（output/tables/，共 59 个）</w:t>
+        <w:t>7.1  所有 CSV 文件（output/tables/，共 62 个）</w:t>
       </w:r>
     </w:p>
     <w:tbl>
@@ -10580,7 +10799,7 @@
           <w:b/>
           <w:sz w:val="21"/>
         </w:rPr>
-        <w:t>7.2  所有图表文件（output/figures/，共 17 个 PNG）</w:t>
+        <w:t>7.2  所有图表文件（output/figures/，共 21 个 PNG）</w:t>
       </w:r>
     </w:p>
     <w:tbl>
@@ -11408,7 +11627,7 @@
         </w:rPr>
         <w:t>— 文档结束 —</w:t>
         <w:br/>
-        <w:t>生成时间：2026-05-27   总脚本数：14   CSV 输出：59 个   图表输出：17 个</w:t>
+        <w:t>生成时间：2026-05-28（更新）   总脚本数：15（14 个 R 脚本 + 1 个 Python 脚本）   CSV 输出：62 个   图表输出：21 个</w:t>
       </w:r>
     </w:p>
     <w:sectPr>

</xml_diff>

<commit_message>
feat: convert post-survey analysis to R (13_post_survey_descriptives.R)
- Add R/13_post_survey_descriptives.R replacing the Python prototype:
  identical output (3 CSV + 2 PNG) verified against 13_post_survey_*.csv
  Uses 00_setup.R conventions: source(), save_csv(), save_fig()
  Packages: readxl, dplyr, ggplot2, scales (all already in pipeline)
  Figure 1: stacked horizontal bar chart with geom_rect + cumulative %
  Figure 2: normalised dot-plot (Median ± IQR + Mean, 0-1 scale)

- Update Process.docx §3.15 heading from .py → .R; method description
  updated from Pandas/SciPy to tidyverse; script count simplified to 15 R

Co-Authored-By: Claude Sonnet 4.6 <noreply@anthropic.com>
</commit_message>
<xml_diff>
--- a/writing_reference/Process.docx
+++ b/writing_reference/Process.docx
@@ -7030,7 +7030,7 @@
         <w:pStyle w:val="Heading2"/>
       </w:pPr>
       <w:r>
-        <w:t xml:space="preserve">3.15  13_post_survey_descriptives.py — 实验后问卷描述性分析（Python）</w:t>
+        <w:t>3.15  13_post_survey_descriptives.R — 实验后问卷描述性分析</w:t>
       </w:r>
     </w:p>
     <w:p>
@@ -7158,7 +7158,7 @@
         <w:pStyle w:val="ListBullet"/>
       </w:pPr>
       <w:r>
-        <w:t xml:space="preserve">描述性统计：M、SD、中位数、IQR（Pandas / SciPy）</w:t>
+        <w:t>描述性统计：M、SD、中位数、IQR（tidyverse: dplyr + base R）</w:t>
       </w:r>
     </w:p>
     <w:p>
@@ -11627,7 +11627,7 @@
         </w:rPr>
         <w:t>— 文档结束 —</w:t>
         <w:br/>
-        <w:t>生成时间：2026-05-28（更新）   总脚本数：15（14 个 R 脚本 + 1 个 Python 脚本）   CSV 输出：62 个   图表输出：21 个</w:t>
+        <w:t>生成时间：2026-05-28（更新）   总脚本数：15   CSV 输出：62 个   图表输出：21 个</w:t>
       </w:r>
     </w:p>
     <w:sectPr>

</xml_diff>